<commit_message>
Update Summer 2026 poems
</commit_message>
<xml_diff>
--- a/ChristianMueth_creative_writings/short fiction/Christian Mueth Summer 2026 Poems.docx
+++ b/ChristianMueth_creative_writings/short fiction/Christian Mueth Summer 2026 Poems.docx
@@ -4,6 +4,26 @@
   <w:body>
     <w:p>
       <w:pPr>
+        <w:rPr>
+          <w:rFonts w:cs="Segoe UI Emoji"/>
+        </w:rPr>
+      </w:pPr>
+      <w:r>
+        <w:rPr>
+          <w:rFonts w:cs="Segoe UI Emoji"/>
+        </w:rPr>
+        <w:t>Date: 7/21/2026</w:t>
+      </w:r>
+    </w:p>
+    <w:p>
+      <w:pPr>
+        <w:rPr>
+          <w:rFonts w:cs="Segoe UI Emoji"/>
+        </w:rPr>
+      </w:pPr>
+    </w:p>
+    <w:p>
+      <w:pPr>
         <w:jc w:val="center"/>
         <w:rPr>
           <w:rFonts w:cs="Segoe UI Emoji"/>
@@ -13,13 +33,7 @@
         <w:rPr>
           <w:rFonts w:cs="Segoe UI Emoji"/>
         </w:rPr>
-        <w:t xml:space="preserve">Christian Mueth </w:t>
-      </w:r>
-      <w:r>
-        <w:rPr>
-          <w:rFonts w:cs="Segoe UI Emoji"/>
-        </w:rPr>
-        <w:t>Summer</w:t>
+        <w:t>Christian Mueth Summer</w:t>
       </w:r>
       <w:r>
         <w:rPr>
@@ -31,18 +45,24 @@
         <w:rPr>
           <w:rFonts w:cs="Segoe UI Emoji"/>
         </w:rPr>
-        <w:t xml:space="preserve"> </w:t>
-      </w:r>
-      <w:r>
-        <w:rPr>
-          <w:rFonts w:cs="Segoe UI Emoji"/>
-        </w:rPr>
-        <w:t>Poems</w:t>
-      </w:r>
-    </w:p>
-    <w:p>
-      <w:r>
-        <w:t>Life is like a painting: it’s however you want to interpret it.</w:t>
+        <w:t xml:space="preserve"> Poems</w:t>
+      </w:r>
+    </w:p>
+    <w:p>
+      <w:r>
+        <w:t>Life is a</w:t>
+      </w:r>
+      <w:r>
+        <w:t xml:space="preserve">n abstract </w:t>
+      </w:r>
+      <w:r>
+        <w:t>painting</w:t>
+      </w:r>
+      <w:r>
+        <w:t xml:space="preserve">, and </w:t>
+      </w:r>
+      <w:r>
+        <w:t>it’s however you want to interpret it.</w:t>
       </w:r>
     </w:p>
     <w:p>
@@ -96,32 +116,56 @@
           <w:i/>
           <w:iCs/>
         </w:rPr>
-        <w:t xml:space="preserve"> </w:t>
-      </w:r>
-      <w:r>
-        <w:rPr>
-          <w:rFonts w:cs="Segoe UI Emoji"/>
-          <w:i/>
-          <w:iCs/>
-        </w:rPr>
-        <w:t>Oh, sweet nothing!</w:t>
-      </w:r>
-    </w:p>
-    <w:p>
-      <w:pPr>
-        <w:rPr>
-          <w:rFonts w:cs="Segoe UI Emoji"/>
-          <w:i/>
-          <w:iCs/>
-        </w:rPr>
-      </w:pPr>
-      <w:r>
-        <w:rPr>
-          <w:rFonts w:cs="Segoe UI Emoji"/>
-          <w:i/>
-          <w:iCs/>
-        </w:rPr>
-        <w:t>Your sweet nothings…</w:t>
+        <w:t>Oh, sweet nothin</w:t>
+      </w:r>
+      <w:r>
+        <w:rPr>
+          <w:rFonts w:cs="Segoe UI Emoji"/>
+          <w:i/>
+          <w:iCs/>
+        </w:rPr>
+        <w:t>g</w:t>
+      </w:r>
+      <w:r>
+        <w:rPr>
+          <w:rFonts w:cs="Segoe UI Emoji"/>
+          <w:i/>
+          <w:iCs/>
+        </w:rPr>
+        <w:t>!</w:t>
+      </w:r>
+    </w:p>
+    <w:p>
+      <w:pPr>
+        <w:rPr>
+          <w:rFonts w:cs="Segoe UI Emoji"/>
+          <w:i/>
+          <w:iCs/>
+        </w:rPr>
+      </w:pPr>
+      <w:r>
+        <w:rPr>
+          <w:rFonts w:cs="Segoe UI Emoji"/>
+          <w:i/>
+          <w:iCs/>
+        </w:rPr>
+        <w:t>Your sweet nothing</w:t>
+      </w:r>
+      <w:r>
+        <w:rPr>
+          <w:rFonts w:cs="Segoe UI Emoji"/>
+          <w:i/>
+          <w:iCs/>
+        </w:rPr>
+        <w:t>s</w:t>
+      </w:r>
+      <w:r>
+        <w:rPr>
+          <w:rFonts w:cs="Segoe UI Emoji"/>
+          <w:i/>
+          <w:iCs/>
+        </w:rPr>
+        <w:t>…</w:t>
       </w:r>
     </w:p>
     <w:p>
@@ -262,7 +306,39 @@
           <w:i/>
           <w:iCs/>
         </w:rPr>
-        <w:t>Kiss. Ease hooks in me.</w:t>
+        <w:t xml:space="preserve">Kiss. </w:t>
+      </w:r>
+      <w:r>
+        <w:rPr>
+          <w:rFonts w:cs="Segoe UI Emoji"/>
+          <w:i/>
+          <w:iCs/>
+        </w:rPr>
+        <w:t>H</w:t>
+      </w:r>
+      <w:r>
+        <w:rPr>
+          <w:rFonts w:cs="Segoe UI Emoji"/>
+          <w:i/>
+          <w:iCs/>
+        </w:rPr>
+        <w:t>ook</w:t>
+      </w:r>
+      <w:r>
+        <w:rPr>
+          <w:rFonts w:cs="Segoe UI Emoji"/>
+          <w:i/>
+          <w:iCs/>
+        </w:rPr>
+        <w:t xml:space="preserve"> to</w:t>
+      </w:r>
+      <w:r>
+        <w:rPr>
+          <w:rFonts w:cs="Segoe UI Emoji"/>
+          <w:i/>
+          <w:iCs/>
+        </w:rPr>
+        <w:t xml:space="preserve"> me.</w:t>
       </w:r>
     </w:p>
     <w:p>
@@ -280,7 +356,23 @@
           <w:i/>
           <w:iCs/>
         </w:rPr>
-        <w:t>Miss. Please set me free!</w:t>
+        <w:t>Miss</w:t>
+      </w:r>
+      <w:r>
+        <w:rPr>
+          <w:rFonts w:cs="Segoe UI Emoji"/>
+          <w:i/>
+          <w:iCs/>
+        </w:rPr>
+        <w:t>. S</w:t>
+      </w:r>
+      <w:r>
+        <w:rPr>
+          <w:rFonts w:cs="Segoe UI Emoji"/>
+          <w:i/>
+          <w:iCs/>
+        </w:rPr>
+        <w:t>et me free!</w:t>
       </w:r>
     </w:p>
     <w:p>
@@ -298,7 +390,15 @@
           <w:i/>
           <w:iCs/>
         </w:rPr>
-        <w:t>Play pretend…</w:t>
+        <w:t>Let’s p</w:t>
+      </w:r>
+      <w:r>
+        <w:rPr>
+          <w:rFonts w:cs="Segoe UI Emoji"/>
+          <w:i/>
+          <w:iCs/>
+        </w:rPr>
+        <w:t>lay pretend…</w:t>
       </w:r>
     </w:p>
     <w:p>
@@ -334,7 +434,15 @@
           <w:i/>
           <w:iCs/>
         </w:rPr>
-        <w:t>In the end…</w:t>
+        <w:t>See, i</w:t>
+      </w:r>
+      <w:r>
+        <w:rPr>
+          <w:rFonts w:cs="Segoe UI Emoji"/>
+          <w:i/>
+          <w:iCs/>
+        </w:rPr>
+        <w:t>n the end…</w:t>
       </w:r>
     </w:p>
     <w:p>
@@ -402,109 +510,107 @@
           <w:i/>
           <w:iCs/>
         </w:rPr>
-        <w:t xml:space="preserve">Not all things are binary. </w:t>
-      </w:r>
-    </w:p>
-    <w:p>
-      <w:pPr>
-        <w:rPr>
-          <w:rFonts w:cs="Segoe UI Emoji"/>
-          <w:i/>
-          <w:iCs/>
-        </w:rPr>
-      </w:pPr>
-      <w:r>
-        <w:rPr>
-          <w:rFonts w:cs="Segoe UI Emoji"/>
-          <w:i/>
-          <w:iCs/>
-        </w:rPr>
-        <w:t xml:space="preserve">Some things are analog. </w:t>
-      </w:r>
-    </w:p>
-    <w:p>
-      <w:pPr>
-        <w:rPr>
-          <w:rFonts w:cs="Segoe UI Emoji"/>
-          <w:i/>
-          <w:iCs/>
-        </w:rPr>
-      </w:pPr>
-      <w:r>
-        <w:rPr>
-          <w:rFonts w:cs="Segoe UI Emoji"/>
-          <w:i/>
-          <w:iCs/>
-        </w:rPr>
-        <w:t>Many find this scary.</w:t>
-      </w:r>
-    </w:p>
-    <w:p>
-      <w:pPr>
-        <w:rPr>
-          <w:rFonts w:cs="Segoe UI Emoji"/>
-          <w:i/>
-          <w:iCs/>
-        </w:rPr>
-      </w:pPr>
-      <w:r>
-        <w:rPr>
-          <w:rFonts w:cs="Segoe UI Emoji"/>
-          <w:i/>
-          <w:iCs/>
-        </w:rPr>
-        <w:t>Can’t fit their boxy blog.</w:t>
-      </w:r>
-    </w:p>
-    <w:p>
-      <w:pPr>
-        <w:rPr>
-          <w:rFonts w:cs="Segoe UI Emoji"/>
-          <w:i/>
-          <w:iCs/>
-        </w:rPr>
-      </w:pPr>
-      <w:r>
-        <w:rPr>
-          <w:rFonts w:cs="Segoe UI Emoji"/>
-          <w:i/>
-          <w:iCs/>
-        </w:rPr>
-        <w:t>Many are analog and binary.</w:t>
-      </w:r>
-    </w:p>
-    <w:p>
-      <w:pPr>
-        <w:rPr>
-          <w:rFonts w:cs="Segoe UI Emoji"/>
-          <w:i/>
-          <w:iCs/>
-        </w:rPr>
-      </w:pPr>
-      <w:r>
-        <w:rPr>
-          <w:rFonts w:cs="Segoe UI Emoji"/>
-          <w:i/>
-          <w:iCs/>
-        </w:rPr>
-        <w:t>Some things are somehow not, given that.</w:t>
-      </w:r>
-    </w:p>
-    <w:p>
-      <w:pPr>
-        <w:rPr>
-          <w:rFonts w:cs="Segoe UI Emoji"/>
-          <w:i/>
-          <w:iCs/>
-        </w:rPr>
-      </w:pPr>
-      <w:r>
-        <w:rPr>
-          <w:rFonts w:cs="Segoe UI Emoji"/>
-          <w:i/>
-          <w:iCs/>
-        </w:rPr>
-        <w:t>It’s totally all arbitrary.</w:t>
+        <w:t xml:space="preserve">Not all are logic bits. </w:t>
+      </w:r>
+    </w:p>
+    <w:p>
+      <w:pPr>
+        <w:rPr>
+          <w:rFonts w:cs="Segoe UI Emoji"/>
+          <w:i/>
+          <w:iCs/>
+        </w:rPr>
+      </w:pPr>
+      <w:r>
+        <w:rPr>
+          <w:rFonts w:cs="Segoe UI Emoji"/>
+          <w:i/>
+          <w:iCs/>
+        </w:rPr>
+        <w:t xml:space="preserve">Some are a spectrum band. </w:t>
+      </w:r>
+    </w:p>
+    <w:p>
+      <w:pPr>
+        <w:rPr>
+          <w:rFonts w:cs="Segoe UI Emoji"/>
+          <w:i/>
+          <w:iCs/>
+        </w:rPr>
+      </w:pPr>
+      <w:r>
+        <w:rPr>
+          <w:rFonts w:cs="Segoe UI Emoji"/>
+          <w:i/>
+          <w:iCs/>
+        </w:rPr>
+        <w:t>This can make some throw fits.</w:t>
+      </w:r>
+    </w:p>
+    <w:p>
+      <w:pPr>
+        <w:rPr>
+          <w:rFonts w:cs="Segoe UI Emoji"/>
+          <w:i/>
+          <w:iCs/>
+        </w:rPr>
+      </w:pPr>
+      <w:r>
+        <w:rPr>
+          <w:rFonts w:cs="Segoe UI Emoji"/>
+          <w:i/>
+          <w:iCs/>
+        </w:rPr>
+        <w:t>Unsettles this strict land.</w:t>
+      </w:r>
+    </w:p>
+    <w:p>
+      <w:pPr>
+        <w:rPr>
+          <w:rFonts w:cs="Segoe UI Emoji"/>
+          <w:i/>
+          <w:iCs/>
+        </w:rPr>
+      </w:pPr>
+      <w:r>
+        <w:rPr>
+          <w:rFonts w:cs="Segoe UI Emoji"/>
+          <w:i/>
+          <w:iCs/>
+        </w:rPr>
+        <w:t>The</w:t>
+      </w:r>
+      <w:r>
+        <w:rPr>
+          <w:rFonts w:cs="Segoe UI Emoji"/>
+          <w:i/>
+          <w:iCs/>
+        </w:rPr>
+        <w:t>se</w:t>
+      </w:r>
+      <w:r>
+        <w:rPr>
+          <w:rFonts w:cs="Segoe UI Emoji"/>
+          <w:i/>
+          <w:iCs/>
+        </w:rPr>
+        <w:t xml:space="preserve"> switches and the</w:t>
+      </w:r>
+      <w:r>
+        <w:rPr>
+          <w:rFonts w:cs="Segoe UI Emoji"/>
+          <w:i/>
+          <w:iCs/>
+        </w:rPr>
+        <w:t>se</w:t>
+      </w:r>
+      <w:r>
+        <w:rPr>
+          <w:rFonts w:cs="Segoe UI Emoji"/>
+          <w:i/>
+          <w:iCs/>
+        </w:rPr>
+        <w:t xml:space="preserve"> dials...</w:t>
       </w:r>
     </w:p>
     <w:p>
@@ -522,7 +628,57 @@
           <w:iCs/>
         </w:rPr>
         <w:lastRenderedPageBreak/>
-        <w:t>Come with me and put on a mad hat.</w:t>
+        <w:t xml:space="preserve">Some </w:t>
+      </w:r>
+      <w:r>
+        <w:rPr>
+          <w:rFonts w:cs="Segoe UI Emoji"/>
+          <w:i/>
+          <w:iCs/>
+        </w:rPr>
+        <w:t>are</w:t>
+      </w:r>
+      <w:r>
+        <w:rPr>
+          <w:rFonts w:cs="Segoe UI Emoji"/>
+          <w:i/>
+          <w:iCs/>
+        </w:rPr>
+        <w:t xml:space="preserve"> both. Some aren't that.</w:t>
+      </w:r>
+    </w:p>
+    <w:p>
+      <w:pPr>
+        <w:rPr>
+          <w:rFonts w:cs="Segoe UI Emoji"/>
+          <w:i/>
+          <w:iCs/>
+        </w:rPr>
+      </w:pPr>
+      <w:r>
+        <w:rPr>
+          <w:rFonts w:cs="Segoe UI Emoji"/>
+          <w:i/>
+          <w:iCs/>
+        </w:rPr>
+        <w:t>It fills me up with smiles.</w:t>
+      </w:r>
+    </w:p>
+    <w:p>
+      <w:pPr>
+        <w:rPr>
+          <w:rFonts w:cs="Segoe UI Emoji"/>
+          <w:i/>
+          <w:iCs/>
+        </w:rPr>
+      </w:pPr>
+      <w:r>
+        <w:rPr>
+          <w:rFonts w:cs="Segoe UI Emoji"/>
+          <w:i/>
+          <w:iCs/>
+        </w:rPr>
+        <w:t>Come put on a mad hat.</w:t>
       </w:r>
     </w:p>
     <w:p>
@@ -557,7 +713,39 @@
           <w:i/>
           <w:iCs/>
         </w:rPr>
-        <w:t>Tonight’s moon is blue,</w:t>
+        <w:t>N</w:t>
+      </w:r>
+      <w:r>
+        <w:rPr>
+          <w:rFonts w:cs="Segoe UI Emoji"/>
+          <w:i/>
+          <w:iCs/>
+        </w:rPr>
+        <w:t>ight’s moon</w:t>
+      </w:r>
+      <w:r>
+        <w:rPr>
+          <w:rFonts w:cs="Segoe UI Emoji"/>
+          <w:i/>
+          <w:iCs/>
+        </w:rPr>
+        <w:t xml:space="preserve"> is </w:t>
+      </w:r>
+      <w:r>
+        <w:rPr>
+          <w:rFonts w:cs="Segoe UI Emoji"/>
+          <w:i/>
+          <w:iCs/>
+        </w:rPr>
+        <w:t>blue</w:t>
+      </w:r>
+      <w:r>
+        <w:rPr>
+          <w:rFonts w:cs="Segoe UI Emoji"/>
+          <w:i/>
+          <w:iCs/>
+        </w:rPr>
+        <w:t>.</w:t>
       </w:r>
     </w:p>
     <w:p>
@@ -575,7 +763,23 @@
           <w:i/>
           <w:iCs/>
         </w:rPr>
-        <w:t>I drive out seeking,</w:t>
+        <w:t xml:space="preserve">I drive </w:t>
+      </w:r>
+      <w:r>
+        <w:rPr>
+          <w:rFonts w:cs="Segoe UI Emoji"/>
+          <w:i/>
+          <w:iCs/>
+        </w:rPr>
+        <w:t xml:space="preserve">and </w:t>
+      </w:r>
+      <w:r>
+        <w:rPr>
+          <w:rFonts w:cs="Segoe UI Emoji"/>
+          <w:i/>
+          <w:iCs/>
+        </w:rPr>
+        <w:t>seek,</w:t>
       </w:r>
     </w:p>
     <w:p>
@@ -593,7 +797,7 @@
           <w:i/>
           <w:iCs/>
         </w:rPr>
-        <w:t>A train and its tracks.</w:t>
+        <w:t>A train and tracks.</w:t>
       </w:r>
     </w:p>
     <w:p>
@@ -611,7 +815,23 @@
           <w:i/>
           <w:iCs/>
         </w:rPr>
-        <w:t>So much I must do,</w:t>
+        <w:t xml:space="preserve">So much </w:t>
+      </w:r>
+      <w:r>
+        <w:rPr>
+          <w:rFonts w:cs="Segoe UI Emoji"/>
+          <w:i/>
+          <w:iCs/>
+        </w:rPr>
+        <w:t xml:space="preserve">to </w:t>
+      </w:r>
+      <w:r>
+        <w:rPr>
+          <w:rFonts w:cs="Segoe UI Emoji"/>
+          <w:i/>
+          <w:iCs/>
+        </w:rPr>
+        <w:t>do,</w:t>
       </w:r>
     </w:p>
     <w:p>
@@ -629,7 +849,23 @@
           <w:i/>
           <w:iCs/>
         </w:rPr>
-        <w:t>And I am screeching,</w:t>
+        <w:t>And I</w:t>
+      </w:r>
+      <w:r>
+        <w:rPr>
+          <w:rFonts w:cs="Segoe UI Emoji"/>
+          <w:i/>
+          <w:iCs/>
+        </w:rPr>
+        <w:t xml:space="preserve"> am weak</w:t>
+      </w:r>
+      <w:r>
+        <w:rPr>
+          <w:rFonts w:cs="Segoe UI Emoji"/>
+          <w:i/>
+          <w:iCs/>
+        </w:rPr>
+        <w:t>,</w:t>
       </w:r>
     </w:p>
     <w:p>
@@ -647,7 +883,7 @@
           <w:i/>
           <w:iCs/>
         </w:rPr>
-        <w:t>For what my soul lacks.</w:t>
+        <w:t>For my soul lacks.</w:t>
       </w:r>
     </w:p>
     <w:p>
@@ -665,7 +901,31 @@
           <w:i/>
           <w:iCs/>
         </w:rPr>
-        <w:t>I haven’t a clue,</w:t>
+        <w:t>I have</w:t>
+      </w:r>
+      <w:r>
+        <w:rPr>
+          <w:rFonts w:cs="Segoe UI Emoji"/>
+          <w:i/>
+          <w:iCs/>
+        </w:rPr>
+        <w:t xml:space="preserve"> no</w:t>
+      </w:r>
+      <w:r>
+        <w:rPr>
+          <w:rFonts w:cs="Segoe UI Emoji"/>
+          <w:i/>
+          <w:iCs/>
+        </w:rPr>
+        <w:t xml:space="preserve"> clue</w:t>
+      </w:r>
+      <w:r>
+        <w:rPr>
+          <w:rFonts w:cs="Segoe UI Emoji"/>
+          <w:i/>
+          <w:iCs/>
+        </w:rPr>
+        <w:t>,</w:t>
       </w:r>
     </w:p>
     <w:p>
@@ -683,7 +943,15 @@
           <w:i/>
           <w:iCs/>
         </w:rPr>
-        <w:t>How it’s still leaking.</w:t>
+        <w:t>How it can l</w:t>
+      </w:r>
+      <w:r>
+        <w:rPr>
+          <w:rFonts w:cs="Segoe UI Emoji"/>
+          <w:i/>
+          <w:iCs/>
+        </w:rPr>
+        <w:t>eak.</w:t>
       </w:r>
     </w:p>
     <w:p>
@@ -701,7 +969,15 @@
           <w:i/>
           <w:iCs/>
         </w:rPr>
-        <w:t>One more of its acts?</w:t>
+        <w:t xml:space="preserve">One of its </w:t>
+      </w:r>
+      <w:r>
+        <w:rPr>
+          <w:rFonts w:cs="Segoe UI Emoji"/>
+          <w:i/>
+          <w:iCs/>
+        </w:rPr>
+        <w:t>acts?</w:t>
       </w:r>
     </w:p>
     <w:p>
@@ -736,39 +1012,183 @@
           <w:i/>
           <w:iCs/>
         </w:rPr>
-        <w:t>Stars twinkle. Planets gleam.</w:t>
-      </w:r>
-    </w:p>
-    <w:p>
-      <w:pPr>
-        <w:rPr>
-          <w:i/>
-          <w:iCs/>
-        </w:rPr>
-      </w:pPr>
-      <w:r>
-        <w:rPr>
-          <w:i/>
-          <w:iCs/>
-        </w:rPr>
-        <w:t>Space crinkles at the seam.</w:t>
+        <w:t>Star twinkle</w:t>
+      </w:r>
+      <w:r>
+        <w:rPr>
+          <w:i/>
+          <w:iCs/>
+        </w:rPr>
+        <w:t>s</w:t>
+      </w:r>
+      <w:r>
+        <w:rPr>
+          <w:i/>
+          <w:iCs/>
+        </w:rPr>
+        <w:t xml:space="preserve">. </w:t>
+      </w:r>
+    </w:p>
+    <w:p>
+      <w:pPr>
+        <w:rPr>
+          <w:i/>
+          <w:iCs/>
+        </w:rPr>
+      </w:pPr>
+      <w:r>
+        <w:rPr>
+          <w:i/>
+          <w:iCs/>
+        </w:rPr>
+        <w:t>Moon rock</w:t>
+      </w:r>
+      <w:r>
+        <w:rPr>
+          <w:i/>
+          <w:iCs/>
+        </w:rPr>
+        <w:t xml:space="preserve"> gleam</w:t>
+      </w:r>
+      <w:r>
+        <w:rPr>
+          <w:i/>
+          <w:iCs/>
+        </w:rPr>
+        <w:t>s</w:t>
+      </w:r>
+      <w:r>
+        <w:rPr>
+          <w:i/>
+          <w:iCs/>
+        </w:rPr>
+        <w:t>.</w:t>
+      </w:r>
+    </w:p>
+    <w:p>
+      <w:pPr>
+        <w:rPr>
+          <w:i/>
+          <w:iCs/>
+        </w:rPr>
+      </w:pPr>
+      <w:r>
+        <w:rPr>
+          <w:i/>
+          <w:iCs/>
+        </w:rPr>
+        <w:t>Space crinkle</w:t>
+      </w:r>
+      <w:r>
+        <w:rPr>
+          <w:i/>
+          <w:iCs/>
+        </w:rPr>
+        <w:t>s.</w:t>
+      </w:r>
+      <w:r>
+        <w:rPr>
+          <w:i/>
+          <w:iCs/>
+        </w:rPr>
+        <w:t xml:space="preserve"> </w:t>
+      </w:r>
+    </w:p>
+    <w:p>
+      <w:pPr>
+        <w:rPr>
+          <w:i/>
+          <w:iCs/>
+        </w:rPr>
+      </w:pPr>
+      <w:r>
+        <w:rPr>
+          <w:i/>
+          <w:iCs/>
+        </w:rPr>
+        <w:t>A</w:t>
+      </w:r>
+      <w:r>
+        <w:rPr>
+          <w:i/>
+          <w:iCs/>
+        </w:rPr>
+        <w:t>t the seam</w:t>
+      </w:r>
+      <w:r>
+        <w:rPr>
+          <w:i/>
+          <w:iCs/>
+        </w:rPr>
+        <w:t>s</w:t>
+      </w:r>
+      <w:r>
+        <w:rPr>
+          <w:i/>
+          <w:iCs/>
+        </w:rPr>
+        <w:t>.</w:t>
       </w:r>
     </w:p>
     <w:p>
       <w:pPr>
         <w:jc w:val="both"/>
         <w:rPr>
-          <w:rFonts w:cs="Segoe UI Emoji"/>
-          <w:i/>
-          <w:iCs/>
-        </w:rPr>
-      </w:pPr>
-      <w:r>
-        <w:rPr>
-          <w:i/>
-          <w:iCs/>
-        </w:rPr>
-        <w:t>Smirk. Inkle. In a dream</w:t>
+          <w:i/>
+          <w:iCs/>
+        </w:rPr>
+      </w:pPr>
+      <w:r>
+        <w:rPr>
+          <w:i/>
+          <w:iCs/>
+        </w:rPr>
+        <w:t>Smirk</w:t>
+      </w:r>
+      <w:r>
+        <w:rPr>
+          <w:i/>
+          <w:iCs/>
+        </w:rPr>
+        <w:t>s</w:t>
+      </w:r>
+      <w:r>
+        <w:rPr>
+          <w:i/>
+          <w:iCs/>
+        </w:rPr>
+        <w:t>. Inkle</w:t>
+      </w:r>
+      <w:r>
+        <w:rPr>
+          <w:i/>
+          <w:iCs/>
+        </w:rPr>
+        <w:t>s</w:t>
+      </w:r>
+      <w:r>
+        <w:rPr>
+          <w:i/>
+          <w:iCs/>
+        </w:rPr>
+        <w:t>.</w:t>
+      </w:r>
+    </w:p>
+    <w:p>
+      <w:pPr>
+        <w:jc w:val="both"/>
+        <w:rPr>
+          <w:rFonts w:cs="Segoe UI Emoji"/>
+          <w:i/>
+          <w:iCs/>
+        </w:rPr>
+      </w:pPr>
+      <w:r>
+        <w:rPr>
+          <w:i/>
+          <w:iCs/>
+        </w:rPr>
+        <w:t>In a dream</w:t>
       </w:r>
       <w:r>
         <w:rPr>
@@ -811,52 +1231,66 @@
           <w:i/>
           <w:iCs/>
         </w:rPr>
-        <w:t>In the corner of my eye,</w:t>
-      </w:r>
-    </w:p>
-    <w:p>
-      <w:pPr>
-        <w:rPr>
-          <w:i/>
-          <w:iCs/>
-        </w:rPr>
-      </w:pPr>
-      <w:r>
-        <w:rPr>
-          <w:i/>
-          <w:iCs/>
-        </w:rPr>
-        <w:t>On the ceiling to the sky,</w:t>
-      </w:r>
-    </w:p>
-    <w:p>
-      <w:pPr>
-        <w:rPr>
-          <w:i/>
-          <w:iCs/>
-        </w:rPr>
-      </w:pPr>
-      <w:r>
-        <w:rPr>
-          <w:i/>
-          <w:iCs/>
-        </w:rPr>
-        <w:t>A chase abounds, until I find,</w:t>
-      </w:r>
-    </w:p>
-    <w:p>
-      <w:pPr>
-        <w:rPr>
-          <w:i/>
-          <w:iCs/>
-        </w:rPr>
-      </w:pPr>
-      <w:r>
-        <w:rPr>
-          <w:i/>
-          <w:iCs/>
-        </w:rPr>
-        <w:t>Elusive shadow, undefined.</w:t>
+        <w:t xml:space="preserve">Within the corner of my eye, </w:t>
+      </w:r>
+    </w:p>
+    <w:p>
+      <w:pPr>
+        <w:rPr>
+          <w:i/>
+          <w:iCs/>
+        </w:rPr>
+      </w:pPr>
+      <w:r>
+        <w:rPr>
+          <w:i/>
+          <w:iCs/>
+        </w:rPr>
+        <w:t xml:space="preserve">Upon the ceiling, near the sky, </w:t>
+      </w:r>
+    </w:p>
+    <w:p>
+      <w:pPr>
+        <w:rPr>
+          <w:i/>
+          <w:iCs/>
+        </w:rPr>
+      </w:pPr>
+      <w:r>
+        <w:rPr>
+          <w:i/>
+          <w:iCs/>
+        </w:rPr>
+        <w:t>A chase abounds until I find</w:t>
+      </w:r>
+      <w:r>
+        <w:rPr>
+          <w:i/>
+          <w:iCs/>
+        </w:rPr>
+        <w:t>,</w:t>
+      </w:r>
+    </w:p>
+    <w:p>
+      <w:pPr>
+        <w:rPr>
+          <w:i/>
+          <w:iCs/>
+        </w:rPr>
+      </w:pPr>
+      <w:r>
+        <w:rPr>
+          <w:i/>
+          <w:iCs/>
+        </w:rPr>
+        <w:t>Elusive shadow</w:t>
+      </w:r>
+      <w:r>
+        <w:rPr>
+          <w:i/>
+          <w:iCs/>
+        </w:rPr>
+        <w:t xml:space="preserve"> not defined.</w:t>
       </w:r>
     </w:p>
     <w:sectPr>

</xml_diff>

<commit_message>
Refresh Summer 2026 poems
</commit_message>
<xml_diff>
--- a/ChristianMueth_creative_writings/short fiction/Christian Mueth Summer 2026 Poems.docx
+++ b/ChristianMueth_creative_writings/short fiction/Christian Mueth Summer 2026 Poems.docx
@@ -4,26 +4,6 @@
   <w:body>
     <w:p>
       <w:pPr>
-        <w:rPr>
-          <w:rFonts w:cs="Segoe UI Emoji"/>
-        </w:rPr>
-      </w:pPr>
-      <w:r>
-        <w:rPr>
-          <w:rFonts w:cs="Segoe UI Emoji"/>
-        </w:rPr>
-        <w:t>Date: 7/21/2026</w:t>
-      </w:r>
-    </w:p>
-    <w:p>
-      <w:pPr>
-        <w:rPr>
-          <w:rFonts w:cs="Segoe UI Emoji"/>
-        </w:rPr>
-      </w:pPr>
-    </w:p>
-    <w:p>
-      <w:pPr>
         <w:jc w:val="center"/>
         <w:rPr>
           <w:rFonts w:cs="Segoe UI Emoji"/>
@@ -210,282 +190,294 @@
           <w:u w:val="single"/>
         </w:rPr>
       </w:pPr>
+      <w:proofErr w:type="gramStart"/>
       <w:r>
         <w:rPr>
           <w:b/>
           <w:bCs/>
           <w:u w:val="single"/>
         </w:rPr>
-        <w:t>Panned:</w:t>
-      </w:r>
-    </w:p>
-    <w:p>
-      <w:pPr>
-        <w:jc w:val="both"/>
-        <w:rPr>
-          <w:rFonts w:cs="Segoe UI Emoji"/>
-          <w:i/>
-          <w:iCs/>
-        </w:rPr>
-      </w:pPr>
-      <w:r>
-        <w:rPr>
-          <w:rFonts w:cs="Segoe UI Emoji"/>
-          <w:i/>
-          <w:iCs/>
-        </w:rPr>
-        <w:t>Wendy darling,</w:t>
-      </w:r>
-    </w:p>
-    <w:p>
-      <w:pPr>
-        <w:jc w:val="both"/>
-        <w:rPr>
-          <w:rFonts w:cs="Segoe UI Emoji"/>
-          <w:i/>
-          <w:iCs/>
-        </w:rPr>
-      </w:pPr>
-      <w:r>
-        <w:rPr>
-          <w:rFonts w:cs="Segoe UI Emoji"/>
-          <w:i/>
-          <w:iCs/>
-        </w:rPr>
-        <w:t>Your eyes, sterling,</w:t>
-      </w:r>
-    </w:p>
-    <w:p>
-      <w:pPr>
-        <w:jc w:val="both"/>
-        <w:rPr>
-          <w:rFonts w:cs="Segoe UI Emoji"/>
-          <w:i/>
-          <w:iCs/>
-        </w:rPr>
-      </w:pPr>
-      <w:r>
-        <w:rPr>
-          <w:rFonts w:cs="Segoe UI Emoji"/>
-          <w:i/>
-          <w:iCs/>
-        </w:rPr>
-        <w:t>End me, darling!</w:t>
-      </w:r>
-    </w:p>
-    <w:p>
-      <w:pPr>
-        <w:jc w:val="both"/>
-        <w:rPr>
-          <w:rFonts w:cs="Segoe UI Emoji"/>
-          <w:i/>
-          <w:iCs/>
-        </w:rPr>
-      </w:pPr>
-      <w:r>
-        <w:rPr>
-          <w:rFonts w:cs="Segoe UI Emoji"/>
-          <w:i/>
-          <w:iCs/>
-        </w:rPr>
-        <w:t>Heart’s unfurling.</w:t>
-      </w:r>
-    </w:p>
-    <w:p>
-      <w:pPr>
-        <w:jc w:val="both"/>
-        <w:rPr>
-          <w:rFonts w:cs="Segoe UI Emoji"/>
-          <w:i/>
-          <w:iCs/>
-        </w:rPr>
-      </w:pPr>
-      <w:r>
-        <w:rPr>
-          <w:rFonts w:cs="Segoe UI Emoji"/>
-          <w:i/>
-          <w:iCs/>
-        </w:rPr>
-        <w:t xml:space="preserve">Kiss. </w:t>
-      </w:r>
-      <w:r>
-        <w:rPr>
-          <w:rFonts w:cs="Segoe UI Emoji"/>
-          <w:i/>
-          <w:iCs/>
-        </w:rPr>
-        <w:t>H</w:t>
-      </w:r>
-      <w:r>
-        <w:rPr>
-          <w:rFonts w:cs="Segoe UI Emoji"/>
-          <w:i/>
-          <w:iCs/>
-        </w:rPr>
-        <w:t>ook</w:t>
-      </w:r>
-      <w:r>
-        <w:rPr>
-          <w:rFonts w:cs="Segoe UI Emoji"/>
-          <w:i/>
-          <w:iCs/>
-        </w:rPr>
-        <w:t xml:space="preserve"> to</w:t>
-      </w:r>
-      <w:r>
-        <w:rPr>
-          <w:rFonts w:cs="Segoe UI Emoji"/>
-          <w:i/>
-          <w:iCs/>
-        </w:rPr>
-        <w:t xml:space="preserve"> me.</w:t>
-      </w:r>
-    </w:p>
-    <w:p>
-      <w:pPr>
-        <w:jc w:val="both"/>
-        <w:rPr>
-          <w:rFonts w:cs="Segoe UI Emoji"/>
-          <w:i/>
-          <w:iCs/>
-        </w:rPr>
-      </w:pPr>
-      <w:r>
-        <w:rPr>
-          <w:rFonts w:cs="Segoe UI Emoji"/>
-          <w:i/>
-          <w:iCs/>
-        </w:rPr>
-        <w:t>Miss</w:t>
-      </w:r>
-      <w:r>
-        <w:rPr>
-          <w:rFonts w:cs="Segoe UI Emoji"/>
-          <w:i/>
-          <w:iCs/>
-        </w:rPr>
-        <w:t>. S</w:t>
-      </w:r>
-      <w:r>
-        <w:rPr>
-          <w:rFonts w:cs="Segoe UI Emoji"/>
-          <w:i/>
-          <w:iCs/>
-        </w:rPr>
-        <w:t>et me free!</w:t>
-      </w:r>
-    </w:p>
-    <w:p>
-      <w:pPr>
-        <w:jc w:val="both"/>
-        <w:rPr>
-          <w:rFonts w:cs="Segoe UI Emoji"/>
-          <w:i/>
-          <w:iCs/>
-        </w:rPr>
-      </w:pPr>
-      <w:r>
-        <w:rPr>
-          <w:rFonts w:cs="Segoe UI Emoji"/>
-          <w:i/>
-          <w:iCs/>
-        </w:rPr>
-        <w:t>Let’s p</w:t>
-      </w:r>
-      <w:r>
-        <w:rPr>
-          <w:rFonts w:cs="Segoe UI Emoji"/>
-          <w:i/>
-          <w:iCs/>
-        </w:rPr>
-        <w:t>lay pretend…</w:t>
-      </w:r>
-    </w:p>
-    <w:p>
-      <w:pPr>
-        <w:jc w:val="both"/>
-        <w:rPr>
-          <w:rFonts w:cs="Segoe UI Emoji"/>
-          <w:i/>
-          <w:iCs/>
-        </w:rPr>
-      </w:pPr>
-      <w:r>
-        <w:rPr>
-          <w:rFonts w:cs="Segoe UI Emoji"/>
-          <w:i/>
-          <w:iCs/>
-        </w:rPr>
-        <w:t>Say you’ll miss me.</w:t>
-      </w:r>
-    </w:p>
-    <w:p>
-      <w:pPr>
-        <w:jc w:val="both"/>
-        <w:rPr>
-          <w:rFonts w:cs="Segoe UI Emoji"/>
-          <w:i/>
-          <w:iCs/>
-        </w:rPr>
-      </w:pPr>
-      <w:r>
-        <w:rPr>
-          <w:rFonts w:cs="Segoe UI Emoji"/>
-          <w:i/>
-          <w:iCs/>
-        </w:rPr>
-        <w:t>See, i</w:t>
-      </w:r>
-      <w:r>
-        <w:rPr>
-          <w:rFonts w:cs="Segoe UI Emoji"/>
-          <w:i/>
-          <w:iCs/>
-        </w:rPr>
-        <w:t>n the end…</w:t>
-      </w:r>
-    </w:p>
-    <w:p>
-      <w:pPr>
-        <w:jc w:val="both"/>
-        <w:rPr>
-          <w:rFonts w:cs="Segoe UI Emoji"/>
-          <w:i/>
-          <w:iCs/>
-        </w:rPr>
-      </w:pPr>
-      <w:r>
-        <w:rPr>
-          <w:rFonts w:cs="Segoe UI Emoji"/>
-          <w:i/>
-          <w:iCs/>
-        </w:rPr>
-        <w:t>It’s my one plea!</w:t>
-      </w:r>
-    </w:p>
-    <w:p>
-      <w:pPr>
+        <w:t>Panned</w:t>
+      </w:r>
+      <w:proofErr w:type="gramEnd"/>
+      <w:r>
         <w:rPr>
           <w:b/>
           <w:bCs/>
           <w:u w:val="single"/>
         </w:rPr>
-      </w:pPr>
-      <w:r>
+        <w:t>:</w:t>
+      </w:r>
+    </w:p>
+    <w:p>
+      <w:pPr>
+        <w:jc w:val="both"/>
+        <w:rPr>
+          <w:rFonts w:cs="Segoe UI Emoji"/>
+          <w:i/>
+          <w:iCs/>
+        </w:rPr>
+      </w:pPr>
+      <w:r>
+        <w:rPr>
+          <w:rFonts w:cs="Segoe UI Emoji"/>
+          <w:i/>
+          <w:iCs/>
+        </w:rPr>
+        <w:t>Wendy darling,</w:t>
+      </w:r>
+    </w:p>
+    <w:p>
+      <w:pPr>
+        <w:jc w:val="both"/>
+        <w:rPr>
+          <w:rFonts w:cs="Segoe UI Emoji"/>
+          <w:i/>
+          <w:iCs/>
+        </w:rPr>
+      </w:pPr>
+      <w:r>
+        <w:rPr>
+          <w:rFonts w:cs="Segoe UI Emoji"/>
+          <w:i/>
+          <w:iCs/>
+        </w:rPr>
+        <w:t>Your eyes, sterling,</w:t>
+      </w:r>
+    </w:p>
+    <w:p>
+      <w:pPr>
+        <w:jc w:val="both"/>
+        <w:rPr>
+          <w:rFonts w:cs="Segoe UI Emoji"/>
+          <w:i/>
+          <w:iCs/>
+        </w:rPr>
+      </w:pPr>
+      <w:r>
+        <w:rPr>
+          <w:rFonts w:cs="Segoe UI Emoji"/>
+          <w:i/>
+          <w:iCs/>
+        </w:rPr>
+        <w:t>End me, darling!</w:t>
+      </w:r>
+    </w:p>
+    <w:p>
+      <w:pPr>
+        <w:jc w:val="both"/>
+        <w:rPr>
+          <w:rFonts w:cs="Segoe UI Emoji"/>
+          <w:i/>
+          <w:iCs/>
+        </w:rPr>
+      </w:pPr>
+      <w:r>
+        <w:rPr>
+          <w:rFonts w:cs="Segoe UI Emoji"/>
+          <w:i/>
+          <w:iCs/>
+        </w:rPr>
+        <w:t>Heart’s unfurling.</w:t>
+      </w:r>
+    </w:p>
+    <w:p>
+      <w:pPr>
+        <w:jc w:val="both"/>
+        <w:rPr>
+          <w:rFonts w:cs="Segoe UI Emoji"/>
+          <w:i/>
+          <w:iCs/>
+        </w:rPr>
+      </w:pPr>
+      <w:proofErr w:type="gramStart"/>
+      <w:r>
+        <w:rPr>
+          <w:rFonts w:cs="Segoe UI Emoji"/>
+          <w:i/>
+          <w:iCs/>
+        </w:rPr>
+        <w:t>Kiss</w:t>
+      </w:r>
+      <w:proofErr w:type="gramEnd"/>
+      <w:r>
+        <w:rPr>
+          <w:rFonts w:cs="Segoe UI Emoji"/>
+          <w:i/>
+          <w:iCs/>
+        </w:rPr>
+        <w:t xml:space="preserve">. </w:t>
+      </w:r>
+      <w:r>
+        <w:rPr>
+          <w:rFonts w:cs="Segoe UI Emoji"/>
+          <w:i/>
+          <w:iCs/>
+        </w:rPr>
+        <w:t>H</w:t>
+      </w:r>
+      <w:r>
+        <w:rPr>
+          <w:rFonts w:cs="Segoe UI Emoji"/>
+          <w:i/>
+          <w:iCs/>
+        </w:rPr>
+        <w:t>ook</w:t>
+      </w:r>
+      <w:r>
+        <w:rPr>
+          <w:rFonts w:cs="Segoe UI Emoji"/>
+          <w:i/>
+          <w:iCs/>
+        </w:rPr>
+        <w:t xml:space="preserve"> to</w:t>
+      </w:r>
+      <w:r>
+        <w:rPr>
+          <w:rFonts w:cs="Segoe UI Emoji"/>
+          <w:i/>
+          <w:iCs/>
+        </w:rPr>
+        <w:t xml:space="preserve"> me.</w:t>
+      </w:r>
+    </w:p>
+    <w:p>
+      <w:pPr>
+        <w:jc w:val="both"/>
+        <w:rPr>
+          <w:rFonts w:cs="Segoe UI Emoji"/>
+          <w:i/>
+          <w:iCs/>
+        </w:rPr>
+      </w:pPr>
+      <w:r>
+        <w:rPr>
+          <w:rFonts w:cs="Segoe UI Emoji"/>
+          <w:i/>
+          <w:iCs/>
+        </w:rPr>
+        <w:t>Miss</w:t>
+      </w:r>
+      <w:r>
+        <w:rPr>
+          <w:rFonts w:cs="Segoe UI Emoji"/>
+          <w:i/>
+          <w:iCs/>
+        </w:rPr>
+        <w:t>. S</w:t>
+      </w:r>
+      <w:r>
+        <w:rPr>
+          <w:rFonts w:cs="Segoe UI Emoji"/>
+          <w:i/>
+          <w:iCs/>
+        </w:rPr>
+        <w:t>et me free!</w:t>
+      </w:r>
+    </w:p>
+    <w:p>
+      <w:pPr>
+        <w:jc w:val="both"/>
+        <w:rPr>
+          <w:rFonts w:cs="Segoe UI Emoji"/>
+          <w:i/>
+          <w:iCs/>
+        </w:rPr>
+      </w:pPr>
+      <w:r>
+        <w:rPr>
+          <w:rFonts w:cs="Segoe UI Emoji"/>
+          <w:i/>
+          <w:iCs/>
+        </w:rPr>
+        <w:t>Let’s p</w:t>
+      </w:r>
+      <w:r>
+        <w:rPr>
+          <w:rFonts w:cs="Segoe UI Emoji"/>
+          <w:i/>
+          <w:iCs/>
+        </w:rPr>
+        <w:t>lay pretend…</w:t>
+      </w:r>
+    </w:p>
+    <w:p>
+      <w:pPr>
+        <w:jc w:val="both"/>
+        <w:rPr>
+          <w:rFonts w:cs="Segoe UI Emoji"/>
+          <w:i/>
+          <w:iCs/>
+        </w:rPr>
+      </w:pPr>
+      <w:r>
+        <w:rPr>
+          <w:rFonts w:cs="Segoe UI Emoji"/>
+          <w:i/>
+          <w:iCs/>
+        </w:rPr>
+        <w:t>Say you’ll miss me.</w:t>
+      </w:r>
+    </w:p>
+    <w:p>
+      <w:pPr>
+        <w:jc w:val="both"/>
+        <w:rPr>
+          <w:rFonts w:cs="Segoe UI Emoji"/>
+          <w:i/>
+          <w:iCs/>
+        </w:rPr>
+      </w:pPr>
+      <w:r>
+        <w:rPr>
+          <w:rFonts w:cs="Segoe UI Emoji"/>
+          <w:i/>
+          <w:iCs/>
+        </w:rPr>
+        <w:t>See, i</w:t>
+      </w:r>
+      <w:r>
+        <w:rPr>
+          <w:rFonts w:cs="Segoe UI Emoji"/>
+          <w:i/>
+          <w:iCs/>
+        </w:rPr>
+        <w:t>n the end…</w:t>
+      </w:r>
+    </w:p>
+    <w:p>
+      <w:pPr>
+        <w:jc w:val="both"/>
+        <w:rPr>
+          <w:rFonts w:cs="Segoe UI Emoji"/>
+          <w:i/>
+          <w:iCs/>
+        </w:rPr>
+      </w:pPr>
+      <w:r>
+        <w:rPr>
+          <w:rFonts w:cs="Segoe UI Emoji"/>
+          <w:i/>
+          <w:iCs/>
+        </w:rPr>
+        <w:t>It’s my one plea!</w:t>
+      </w:r>
+    </w:p>
+    <w:p>
+      <w:pPr>
         <w:rPr>
           <w:b/>
           <w:bCs/>
           <w:u w:val="single"/>
         </w:rPr>
-        <w:t>Binary System</w:t>
-      </w:r>
+      </w:pPr>
       <w:r>
         <w:rPr>
           <w:b/>
           <w:bCs/>
           <w:u w:val="single"/>
         </w:rPr>
-        <w:t>s</w:t>
+        <w:t>Binary System</w:t>
       </w:r>
       <w:r>
         <w:rPr>
@@ -493,729 +485,737 @@
           <w:bCs/>
           <w:u w:val="single"/>
         </w:rPr>
-        <w:t>:</w:t>
-      </w:r>
-    </w:p>
-    <w:p>
-      <w:pPr>
-        <w:rPr>
-          <w:rFonts w:cs="Segoe UI Emoji"/>
-          <w:i/>
-          <w:iCs/>
-        </w:rPr>
-      </w:pPr>
-      <w:r>
-        <w:rPr>
-          <w:rFonts w:cs="Segoe UI Emoji"/>
-          <w:i/>
-          <w:iCs/>
-        </w:rPr>
-        <w:t xml:space="preserve">Not all are logic bits. </w:t>
-      </w:r>
-    </w:p>
-    <w:p>
-      <w:pPr>
-        <w:rPr>
-          <w:rFonts w:cs="Segoe UI Emoji"/>
-          <w:i/>
-          <w:iCs/>
-        </w:rPr>
-      </w:pPr>
-      <w:r>
-        <w:rPr>
-          <w:rFonts w:cs="Segoe UI Emoji"/>
-          <w:i/>
-          <w:iCs/>
-        </w:rPr>
-        <w:t xml:space="preserve">Some are a spectrum band. </w:t>
-      </w:r>
-    </w:p>
-    <w:p>
-      <w:pPr>
-        <w:rPr>
-          <w:rFonts w:cs="Segoe UI Emoji"/>
-          <w:i/>
-          <w:iCs/>
-        </w:rPr>
-      </w:pPr>
-      <w:r>
-        <w:rPr>
-          <w:rFonts w:cs="Segoe UI Emoji"/>
-          <w:i/>
-          <w:iCs/>
-        </w:rPr>
-        <w:t>This can make some throw fits.</w:t>
-      </w:r>
-    </w:p>
-    <w:p>
-      <w:pPr>
-        <w:rPr>
-          <w:rFonts w:cs="Segoe UI Emoji"/>
-          <w:i/>
-          <w:iCs/>
-        </w:rPr>
-      </w:pPr>
-      <w:r>
-        <w:rPr>
-          <w:rFonts w:cs="Segoe UI Emoji"/>
-          <w:i/>
-          <w:iCs/>
-        </w:rPr>
-        <w:t>Unsettles this strict land.</w:t>
-      </w:r>
-    </w:p>
-    <w:p>
-      <w:pPr>
-        <w:rPr>
-          <w:rFonts w:cs="Segoe UI Emoji"/>
-          <w:i/>
-          <w:iCs/>
-        </w:rPr>
-      </w:pPr>
-      <w:r>
-        <w:rPr>
-          <w:rFonts w:cs="Segoe UI Emoji"/>
-          <w:i/>
-          <w:iCs/>
-        </w:rPr>
-        <w:t>The</w:t>
-      </w:r>
-      <w:r>
-        <w:rPr>
-          <w:rFonts w:cs="Segoe UI Emoji"/>
-          <w:i/>
-          <w:iCs/>
-        </w:rPr>
-        <w:t>se</w:t>
-      </w:r>
-      <w:r>
-        <w:rPr>
-          <w:rFonts w:cs="Segoe UI Emoji"/>
-          <w:i/>
-          <w:iCs/>
-        </w:rPr>
-        <w:t xml:space="preserve"> switches and the</w:t>
-      </w:r>
-      <w:r>
-        <w:rPr>
-          <w:rFonts w:cs="Segoe UI Emoji"/>
-          <w:i/>
-          <w:iCs/>
-        </w:rPr>
-        <w:t>se</w:t>
-      </w:r>
-      <w:r>
-        <w:rPr>
-          <w:rFonts w:cs="Segoe UI Emoji"/>
-          <w:i/>
-          <w:iCs/>
-        </w:rPr>
-        <w:t xml:space="preserve"> dials...</w:t>
-      </w:r>
-    </w:p>
-    <w:p>
-      <w:pPr>
-        <w:rPr>
-          <w:rFonts w:cs="Segoe UI Emoji"/>
-          <w:i/>
-          <w:iCs/>
-        </w:rPr>
-      </w:pPr>
-      <w:r>
-        <w:rPr>
-          <w:rFonts w:cs="Segoe UI Emoji"/>
-          <w:i/>
-          <w:iCs/>
-        </w:rPr>
-        <w:lastRenderedPageBreak/>
-        <w:t xml:space="preserve">Some </w:t>
-      </w:r>
-      <w:r>
-        <w:rPr>
-          <w:rFonts w:cs="Segoe UI Emoji"/>
-          <w:i/>
-          <w:iCs/>
-        </w:rPr>
-        <w:t>are</w:t>
-      </w:r>
-      <w:r>
-        <w:rPr>
-          <w:rFonts w:cs="Segoe UI Emoji"/>
-          <w:i/>
-          <w:iCs/>
-        </w:rPr>
-        <w:t xml:space="preserve"> both. Some aren't that.</w:t>
-      </w:r>
-    </w:p>
-    <w:p>
-      <w:pPr>
-        <w:rPr>
-          <w:rFonts w:cs="Segoe UI Emoji"/>
-          <w:i/>
-          <w:iCs/>
-        </w:rPr>
-      </w:pPr>
-      <w:r>
-        <w:rPr>
-          <w:rFonts w:cs="Segoe UI Emoji"/>
-          <w:i/>
-          <w:iCs/>
-        </w:rPr>
-        <w:t>It fills me up with smiles.</w:t>
-      </w:r>
-    </w:p>
-    <w:p>
-      <w:pPr>
-        <w:rPr>
-          <w:rFonts w:cs="Segoe UI Emoji"/>
-          <w:i/>
-          <w:iCs/>
-        </w:rPr>
-      </w:pPr>
-      <w:r>
-        <w:rPr>
-          <w:rFonts w:cs="Segoe UI Emoji"/>
-          <w:i/>
-          <w:iCs/>
-        </w:rPr>
-        <w:t>Come put on a mad hat.</w:t>
-      </w:r>
-    </w:p>
-    <w:p>
-      <w:pPr>
+        <w:t>s</w:t>
+      </w:r>
+      <w:r>
         <w:rPr>
           <w:b/>
           <w:bCs/>
           <w:u w:val="single"/>
         </w:rPr>
-      </w:pPr>
-      <w:r>
+        <w:t>:</w:t>
+      </w:r>
+    </w:p>
+    <w:p>
+      <w:pPr>
+        <w:rPr>
+          <w:rFonts w:cs="Segoe UI Emoji"/>
+          <w:i/>
+          <w:iCs/>
+        </w:rPr>
+      </w:pPr>
+      <w:r>
+        <w:rPr>
+          <w:rFonts w:cs="Segoe UI Emoji"/>
+          <w:i/>
+          <w:iCs/>
+        </w:rPr>
+        <w:t xml:space="preserve">Not all are logic bits. </w:t>
+      </w:r>
+    </w:p>
+    <w:p>
+      <w:pPr>
+        <w:rPr>
+          <w:rFonts w:cs="Segoe UI Emoji"/>
+          <w:i/>
+          <w:iCs/>
+        </w:rPr>
+      </w:pPr>
+      <w:r>
+        <w:rPr>
+          <w:rFonts w:cs="Segoe UI Emoji"/>
+          <w:i/>
+          <w:iCs/>
+        </w:rPr>
+        <w:t xml:space="preserve">Some are a spectrum band. </w:t>
+      </w:r>
+    </w:p>
+    <w:p>
+      <w:pPr>
+        <w:rPr>
+          <w:rFonts w:cs="Segoe UI Emoji"/>
+          <w:i/>
+          <w:iCs/>
+        </w:rPr>
+      </w:pPr>
+      <w:r>
+        <w:rPr>
+          <w:rFonts w:cs="Segoe UI Emoji"/>
+          <w:i/>
+          <w:iCs/>
+        </w:rPr>
+        <w:t>This can make some throw fits.</w:t>
+      </w:r>
+    </w:p>
+    <w:p>
+      <w:pPr>
+        <w:rPr>
+          <w:rFonts w:cs="Segoe UI Emoji"/>
+          <w:i/>
+          <w:iCs/>
+        </w:rPr>
+      </w:pPr>
+      <w:r>
+        <w:rPr>
+          <w:rFonts w:cs="Segoe UI Emoji"/>
+          <w:i/>
+          <w:iCs/>
+        </w:rPr>
+        <w:t>Unsettles this strict land.</w:t>
+      </w:r>
+    </w:p>
+    <w:p>
+      <w:pPr>
+        <w:rPr>
+          <w:rFonts w:cs="Segoe UI Emoji"/>
+          <w:i/>
+          <w:iCs/>
+        </w:rPr>
+      </w:pPr>
+      <w:r>
+        <w:rPr>
+          <w:rFonts w:cs="Segoe UI Emoji"/>
+          <w:i/>
+          <w:iCs/>
+        </w:rPr>
+        <w:t>The</w:t>
+      </w:r>
+      <w:r>
+        <w:rPr>
+          <w:rFonts w:cs="Segoe UI Emoji"/>
+          <w:i/>
+          <w:iCs/>
+        </w:rPr>
+        <w:t>se</w:t>
+      </w:r>
+      <w:r>
+        <w:rPr>
+          <w:rFonts w:cs="Segoe UI Emoji"/>
+          <w:i/>
+          <w:iCs/>
+        </w:rPr>
+        <w:t xml:space="preserve"> switches and the</w:t>
+      </w:r>
+      <w:r>
+        <w:rPr>
+          <w:rFonts w:cs="Segoe UI Emoji"/>
+          <w:i/>
+          <w:iCs/>
+        </w:rPr>
+        <w:t>se</w:t>
+      </w:r>
+      <w:r>
+        <w:rPr>
+          <w:rFonts w:cs="Segoe UI Emoji"/>
+          <w:i/>
+          <w:iCs/>
+        </w:rPr>
+        <w:t xml:space="preserve"> dials...</w:t>
+      </w:r>
+    </w:p>
+    <w:p>
+      <w:pPr>
+        <w:rPr>
+          <w:rFonts w:cs="Segoe UI Emoji"/>
+          <w:i/>
+          <w:iCs/>
+        </w:rPr>
+      </w:pPr>
+      <w:r>
+        <w:rPr>
+          <w:rFonts w:cs="Segoe UI Emoji"/>
+          <w:i/>
+          <w:iCs/>
+        </w:rPr>
+        <w:t xml:space="preserve">Some </w:t>
+      </w:r>
+      <w:r>
+        <w:rPr>
+          <w:rFonts w:cs="Segoe UI Emoji"/>
+          <w:i/>
+          <w:iCs/>
+        </w:rPr>
+        <w:t>are</w:t>
+      </w:r>
+      <w:r>
+        <w:rPr>
+          <w:rFonts w:cs="Segoe UI Emoji"/>
+          <w:i/>
+          <w:iCs/>
+        </w:rPr>
+        <w:t xml:space="preserve"> both. Some aren't that.</w:t>
+      </w:r>
+    </w:p>
+    <w:p>
+      <w:pPr>
+        <w:rPr>
+          <w:rFonts w:cs="Segoe UI Emoji"/>
+          <w:i/>
+          <w:iCs/>
+        </w:rPr>
+      </w:pPr>
+      <w:r>
+        <w:rPr>
+          <w:rFonts w:cs="Segoe UI Emoji"/>
+          <w:i/>
+          <w:iCs/>
+        </w:rPr>
+        <w:t>It fills me up with smiles.</w:t>
+      </w:r>
+    </w:p>
+    <w:p>
+      <w:pPr>
+        <w:rPr>
+          <w:rFonts w:cs="Segoe UI Emoji"/>
+          <w:i/>
+          <w:iCs/>
+        </w:rPr>
+      </w:pPr>
+      <w:r>
+        <w:rPr>
+          <w:rFonts w:cs="Segoe UI Emoji"/>
+          <w:i/>
+          <w:iCs/>
+        </w:rPr>
+        <w:lastRenderedPageBreak/>
+        <w:t>Come put on a mad hat.</w:t>
+      </w:r>
+    </w:p>
+    <w:p>
+      <w:pPr>
         <w:rPr>
           <w:b/>
           <w:bCs/>
           <w:u w:val="single"/>
         </w:rPr>
-        <w:t>It Tracks:</w:t>
-      </w:r>
-    </w:p>
-    <w:p>
-      <w:pPr>
-        <w:jc w:val="both"/>
-        <w:rPr>
-          <w:rFonts w:cs="Segoe UI Emoji"/>
-          <w:i/>
-          <w:iCs/>
-        </w:rPr>
-      </w:pPr>
-      <w:r>
-        <w:rPr>
-          <w:rFonts w:cs="Segoe UI Emoji"/>
-          <w:i/>
-          <w:iCs/>
-        </w:rPr>
-        <w:t>N</w:t>
-      </w:r>
-      <w:r>
-        <w:rPr>
-          <w:rFonts w:cs="Segoe UI Emoji"/>
-          <w:i/>
-          <w:iCs/>
-        </w:rPr>
-        <w:t>ight’s moon</w:t>
-      </w:r>
-      <w:r>
-        <w:rPr>
-          <w:rFonts w:cs="Segoe UI Emoji"/>
-          <w:i/>
-          <w:iCs/>
-        </w:rPr>
-        <w:t xml:space="preserve"> is </w:t>
-      </w:r>
-      <w:r>
-        <w:rPr>
-          <w:rFonts w:cs="Segoe UI Emoji"/>
-          <w:i/>
-          <w:iCs/>
-        </w:rPr>
-        <w:t>blue</w:t>
-      </w:r>
-      <w:r>
-        <w:rPr>
-          <w:rFonts w:cs="Segoe UI Emoji"/>
-          <w:i/>
-          <w:iCs/>
-        </w:rPr>
-        <w:t>.</w:t>
-      </w:r>
-    </w:p>
-    <w:p>
-      <w:pPr>
-        <w:jc w:val="both"/>
-        <w:rPr>
-          <w:rFonts w:cs="Segoe UI Emoji"/>
-          <w:i/>
-          <w:iCs/>
-        </w:rPr>
-      </w:pPr>
-      <w:r>
-        <w:rPr>
-          <w:rFonts w:cs="Segoe UI Emoji"/>
-          <w:i/>
-          <w:iCs/>
-        </w:rPr>
-        <w:t xml:space="preserve">I drive </w:t>
-      </w:r>
-      <w:r>
-        <w:rPr>
-          <w:rFonts w:cs="Segoe UI Emoji"/>
-          <w:i/>
-          <w:iCs/>
-        </w:rPr>
-        <w:t xml:space="preserve">and </w:t>
-      </w:r>
-      <w:r>
-        <w:rPr>
-          <w:rFonts w:cs="Segoe UI Emoji"/>
-          <w:i/>
-          <w:iCs/>
-        </w:rPr>
-        <w:t>seek,</w:t>
-      </w:r>
-    </w:p>
-    <w:p>
-      <w:pPr>
-        <w:jc w:val="both"/>
-        <w:rPr>
-          <w:rFonts w:cs="Segoe UI Emoji"/>
-          <w:i/>
-          <w:iCs/>
-        </w:rPr>
-      </w:pPr>
-      <w:r>
-        <w:rPr>
-          <w:rFonts w:cs="Segoe UI Emoji"/>
-          <w:i/>
-          <w:iCs/>
-        </w:rPr>
-        <w:t>A train and tracks.</w:t>
-      </w:r>
-    </w:p>
-    <w:p>
-      <w:pPr>
-        <w:jc w:val="both"/>
-        <w:rPr>
-          <w:rFonts w:cs="Segoe UI Emoji"/>
-          <w:i/>
-          <w:iCs/>
-        </w:rPr>
-      </w:pPr>
-      <w:r>
-        <w:rPr>
-          <w:rFonts w:cs="Segoe UI Emoji"/>
-          <w:i/>
-          <w:iCs/>
-        </w:rPr>
-        <w:t xml:space="preserve">So much </w:t>
-      </w:r>
-      <w:r>
-        <w:rPr>
-          <w:rFonts w:cs="Segoe UI Emoji"/>
-          <w:i/>
-          <w:iCs/>
-        </w:rPr>
-        <w:t xml:space="preserve">to </w:t>
-      </w:r>
-      <w:r>
-        <w:rPr>
-          <w:rFonts w:cs="Segoe UI Emoji"/>
-          <w:i/>
-          <w:iCs/>
-        </w:rPr>
-        <w:t>do,</w:t>
-      </w:r>
-    </w:p>
-    <w:p>
-      <w:pPr>
-        <w:jc w:val="both"/>
-        <w:rPr>
-          <w:rFonts w:cs="Segoe UI Emoji"/>
-          <w:i/>
-          <w:iCs/>
-        </w:rPr>
-      </w:pPr>
-      <w:r>
-        <w:rPr>
-          <w:rFonts w:cs="Segoe UI Emoji"/>
-          <w:i/>
-          <w:iCs/>
-        </w:rPr>
-        <w:t>And I</w:t>
-      </w:r>
-      <w:r>
-        <w:rPr>
-          <w:rFonts w:cs="Segoe UI Emoji"/>
-          <w:i/>
-          <w:iCs/>
-        </w:rPr>
-        <w:t xml:space="preserve"> am weak</w:t>
-      </w:r>
-      <w:r>
-        <w:rPr>
-          <w:rFonts w:cs="Segoe UI Emoji"/>
-          <w:i/>
-          <w:iCs/>
-        </w:rPr>
-        <w:t>,</w:t>
-      </w:r>
-    </w:p>
-    <w:p>
-      <w:pPr>
-        <w:jc w:val="both"/>
-        <w:rPr>
-          <w:rFonts w:cs="Segoe UI Emoji"/>
-          <w:i/>
-          <w:iCs/>
-        </w:rPr>
-      </w:pPr>
-      <w:r>
-        <w:rPr>
-          <w:rFonts w:cs="Segoe UI Emoji"/>
-          <w:i/>
-          <w:iCs/>
-        </w:rPr>
-        <w:t>For my soul lacks.</w:t>
-      </w:r>
-    </w:p>
-    <w:p>
-      <w:pPr>
-        <w:jc w:val="both"/>
-        <w:rPr>
-          <w:rFonts w:cs="Segoe UI Emoji"/>
-          <w:i/>
-          <w:iCs/>
-        </w:rPr>
-      </w:pPr>
-      <w:r>
-        <w:rPr>
-          <w:rFonts w:cs="Segoe UI Emoji"/>
-          <w:i/>
-          <w:iCs/>
-        </w:rPr>
-        <w:t>I have</w:t>
-      </w:r>
-      <w:r>
-        <w:rPr>
-          <w:rFonts w:cs="Segoe UI Emoji"/>
-          <w:i/>
-          <w:iCs/>
-        </w:rPr>
-        <w:t xml:space="preserve"> no</w:t>
-      </w:r>
-      <w:r>
-        <w:rPr>
-          <w:rFonts w:cs="Segoe UI Emoji"/>
-          <w:i/>
-          <w:iCs/>
-        </w:rPr>
-        <w:t xml:space="preserve"> clue</w:t>
-      </w:r>
-      <w:r>
-        <w:rPr>
-          <w:rFonts w:cs="Segoe UI Emoji"/>
-          <w:i/>
-          <w:iCs/>
-        </w:rPr>
-        <w:t>,</w:t>
-      </w:r>
-    </w:p>
-    <w:p>
-      <w:pPr>
-        <w:jc w:val="both"/>
-        <w:rPr>
-          <w:rFonts w:cs="Segoe UI Emoji"/>
-          <w:i/>
-          <w:iCs/>
-        </w:rPr>
-      </w:pPr>
-      <w:r>
-        <w:rPr>
-          <w:rFonts w:cs="Segoe UI Emoji"/>
-          <w:i/>
-          <w:iCs/>
-        </w:rPr>
-        <w:t>How it can l</w:t>
-      </w:r>
-      <w:r>
-        <w:rPr>
-          <w:rFonts w:cs="Segoe UI Emoji"/>
-          <w:i/>
-          <w:iCs/>
-        </w:rPr>
-        <w:t>eak.</w:t>
-      </w:r>
-    </w:p>
-    <w:p>
-      <w:pPr>
-        <w:jc w:val="both"/>
-        <w:rPr>
-          <w:rFonts w:cs="Segoe UI Emoji"/>
-          <w:i/>
-          <w:iCs/>
-        </w:rPr>
-      </w:pPr>
-      <w:r>
-        <w:rPr>
-          <w:rFonts w:cs="Segoe UI Emoji"/>
-          <w:i/>
-          <w:iCs/>
-        </w:rPr>
-        <w:t xml:space="preserve">One of its </w:t>
-      </w:r>
-      <w:r>
-        <w:rPr>
-          <w:rFonts w:cs="Segoe UI Emoji"/>
-          <w:i/>
-          <w:iCs/>
-        </w:rPr>
-        <w:t>acts?</w:t>
-      </w:r>
-    </w:p>
-    <w:p>
-      <w:pPr>
-        <w:jc w:val="both"/>
-        <w:rPr>
-          <w:rFonts w:cs="Segoe UI Emoji"/>
+      </w:pPr>
+      <w:r>
+        <w:rPr>
           <w:b/>
           <w:bCs/>
           <w:u w:val="single"/>
         </w:rPr>
-      </w:pPr>
-      <w:r>
+        <w:t>It Tracks:</w:t>
+      </w:r>
+    </w:p>
+    <w:p>
+      <w:pPr>
+        <w:jc w:val="both"/>
+        <w:rPr>
+          <w:rFonts w:cs="Segoe UI Emoji"/>
+          <w:i/>
+          <w:iCs/>
+        </w:rPr>
+      </w:pPr>
+      <w:r>
+        <w:rPr>
+          <w:rFonts w:cs="Segoe UI Emoji"/>
+          <w:i/>
+          <w:iCs/>
+        </w:rPr>
+        <w:t>N</w:t>
+      </w:r>
+      <w:r>
+        <w:rPr>
+          <w:rFonts w:cs="Segoe UI Emoji"/>
+          <w:i/>
+          <w:iCs/>
+        </w:rPr>
+        <w:t>ight’s moon</w:t>
+      </w:r>
+      <w:r>
+        <w:rPr>
+          <w:rFonts w:cs="Segoe UI Emoji"/>
+          <w:i/>
+          <w:iCs/>
+        </w:rPr>
+        <w:t xml:space="preserve"> is </w:t>
+      </w:r>
+      <w:r>
+        <w:rPr>
+          <w:rFonts w:cs="Segoe UI Emoji"/>
+          <w:i/>
+          <w:iCs/>
+        </w:rPr>
+        <w:t>blue</w:t>
+      </w:r>
+      <w:r>
+        <w:rPr>
+          <w:rFonts w:cs="Segoe UI Emoji"/>
+          <w:i/>
+          <w:iCs/>
+        </w:rPr>
+        <w:t>.</w:t>
+      </w:r>
+    </w:p>
+    <w:p>
+      <w:pPr>
+        <w:jc w:val="both"/>
+        <w:rPr>
+          <w:rFonts w:cs="Segoe UI Emoji"/>
+          <w:i/>
+          <w:iCs/>
+        </w:rPr>
+      </w:pPr>
+      <w:r>
+        <w:rPr>
+          <w:rFonts w:cs="Segoe UI Emoji"/>
+          <w:i/>
+          <w:iCs/>
+        </w:rPr>
+        <w:t xml:space="preserve">I drive </w:t>
+      </w:r>
+      <w:r>
+        <w:rPr>
+          <w:rFonts w:cs="Segoe UI Emoji"/>
+          <w:i/>
+          <w:iCs/>
+        </w:rPr>
+        <w:t xml:space="preserve">and </w:t>
+      </w:r>
+      <w:r>
+        <w:rPr>
+          <w:rFonts w:cs="Segoe UI Emoji"/>
+          <w:i/>
+          <w:iCs/>
+        </w:rPr>
+        <w:t>seek,</w:t>
+      </w:r>
+    </w:p>
+    <w:p>
+      <w:pPr>
+        <w:jc w:val="both"/>
+        <w:rPr>
+          <w:rFonts w:cs="Segoe UI Emoji"/>
+          <w:i/>
+          <w:iCs/>
+        </w:rPr>
+      </w:pPr>
+      <w:r>
+        <w:rPr>
+          <w:rFonts w:cs="Segoe UI Emoji"/>
+          <w:i/>
+          <w:iCs/>
+        </w:rPr>
+        <w:t>A train and tracks.</w:t>
+      </w:r>
+    </w:p>
+    <w:p>
+      <w:pPr>
+        <w:jc w:val="both"/>
+        <w:rPr>
+          <w:rFonts w:cs="Segoe UI Emoji"/>
+          <w:i/>
+          <w:iCs/>
+        </w:rPr>
+      </w:pPr>
+      <w:r>
+        <w:rPr>
+          <w:rFonts w:cs="Segoe UI Emoji"/>
+          <w:i/>
+          <w:iCs/>
+        </w:rPr>
+        <w:t xml:space="preserve">So much </w:t>
+      </w:r>
+      <w:r>
+        <w:rPr>
+          <w:rFonts w:cs="Segoe UI Emoji"/>
+          <w:i/>
+          <w:iCs/>
+        </w:rPr>
+        <w:t xml:space="preserve">to </w:t>
+      </w:r>
+      <w:r>
+        <w:rPr>
+          <w:rFonts w:cs="Segoe UI Emoji"/>
+          <w:i/>
+          <w:iCs/>
+        </w:rPr>
+        <w:t>do,</w:t>
+      </w:r>
+    </w:p>
+    <w:p>
+      <w:pPr>
+        <w:jc w:val="both"/>
+        <w:rPr>
+          <w:rFonts w:cs="Segoe UI Emoji"/>
+          <w:i/>
+          <w:iCs/>
+        </w:rPr>
+      </w:pPr>
+      <w:r>
+        <w:rPr>
+          <w:rFonts w:cs="Segoe UI Emoji"/>
+          <w:i/>
+          <w:iCs/>
+        </w:rPr>
+        <w:t>And I</w:t>
+      </w:r>
+      <w:r>
+        <w:rPr>
+          <w:rFonts w:cs="Segoe UI Emoji"/>
+          <w:i/>
+          <w:iCs/>
+        </w:rPr>
+        <w:t xml:space="preserve"> am weak</w:t>
+      </w:r>
+      <w:r>
+        <w:rPr>
+          <w:rFonts w:cs="Segoe UI Emoji"/>
+          <w:i/>
+          <w:iCs/>
+        </w:rPr>
+        <w:t>,</w:t>
+      </w:r>
+    </w:p>
+    <w:p>
+      <w:pPr>
+        <w:jc w:val="both"/>
+        <w:rPr>
+          <w:rFonts w:cs="Segoe UI Emoji"/>
+          <w:i/>
+          <w:iCs/>
+        </w:rPr>
+      </w:pPr>
+      <w:r>
+        <w:rPr>
+          <w:rFonts w:cs="Segoe UI Emoji"/>
+          <w:i/>
+          <w:iCs/>
+        </w:rPr>
+        <w:t>For my soul lacks.</w:t>
+      </w:r>
+    </w:p>
+    <w:p>
+      <w:pPr>
+        <w:jc w:val="both"/>
+        <w:rPr>
+          <w:rFonts w:cs="Segoe UI Emoji"/>
+          <w:i/>
+          <w:iCs/>
+        </w:rPr>
+      </w:pPr>
+      <w:r>
+        <w:rPr>
+          <w:rFonts w:cs="Segoe UI Emoji"/>
+          <w:i/>
+          <w:iCs/>
+        </w:rPr>
+        <w:t>I have</w:t>
+      </w:r>
+      <w:r>
+        <w:rPr>
+          <w:rFonts w:cs="Segoe UI Emoji"/>
+          <w:i/>
+          <w:iCs/>
+        </w:rPr>
+        <w:t xml:space="preserve"> no</w:t>
+      </w:r>
+      <w:r>
+        <w:rPr>
+          <w:rFonts w:cs="Segoe UI Emoji"/>
+          <w:i/>
+          <w:iCs/>
+        </w:rPr>
+        <w:t xml:space="preserve"> clue</w:t>
+      </w:r>
+      <w:r>
+        <w:rPr>
+          <w:rFonts w:cs="Segoe UI Emoji"/>
+          <w:i/>
+          <w:iCs/>
+        </w:rPr>
+        <w:t>,</w:t>
+      </w:r>
+    </w:p>
+    <w:p>
+      <w:pPr>
+        <w:jc w:val="both"/>
+        <w:rPr>
+          <w:rFonts w:cs="Segoe UI Emoji"/>
+          <w:i/>
+          <w:iCs/>
+        </w:rPr>
+      </w:pPr>
+      <w:r>
+        <w:rPr>
+          <w:rFonts w:cs="Segoe UI Emoji"/>
+          <w:i/>
+          <w:iCs/>
+        </w:rPr>
+        <w:t>How it can l</w:t>
+      </w:r>
+      <w:r>
+        <w:rPr>
+          <w:rFonts w:cs="Segoe UI Emoji"/>
+          <w:i/>
+          <w:iCs/>
+        </w:rPr>
+        <w:t>eak.</w:t>
+      </w:r>
+    </w:p>
+    <w:p>
+      <w:pPr>
+        <w:jc w:val="both"/>
+        <w:rPr>
+          <w:rFonts w:cs="Segoe UI Emoji"/>
+          <w:i/>
+          <w:iCs/>
+        </w:rPr>
+      </w:pPr>
+      <w:r>
+        <w:rPr>
+          <w:rFonts w:cs="Segoe UI Emoji"/>
+          <w:i/>
+          <w:iCs/>
+        </w:rPr>
+        <w:t xml:space="preserve">One of its </w:t>
+      </w:r>
+      <w:r>
+        <w:rPr>
+          <w:rFonts w:cs="Segoe UI Emoji"/>
+          <w:i/>
+          <w:iCs/>
+        </w:rPr>
+        <w:t>acts?</w:t>
+      </w:r>
+    </w:p>
+    <w:p>
+      <w:pPr>
+        <w:jc w:val="both"/>
         <w:rPr>
           <w:rFonts w:cs="Segoe UI Emoji"/>
           <w:b/>
           <w:bCs/>
           <w:u w:val="single"/>
         </w:rPr>
-        <w:t>Star Woven:</w:t>
-      </w:r>
-    </w:p>
-    <w:p>
-      <w:pPr>
-        <w:rPr>
-          <w:i/>
-          <w:iCs/>
-        </w:rPr>
-      </w:pPr>
-      <w:r>
-        <w:rPr>
-          <w:i/>
-          <w:iCs/>
-        </w:rPr>
-        <w:t>Star twinkle</w:t>
-      </w:r>
-      <w:r>
-        <w:rPr>
-          <w:i/>
-          <w:iCs/>
-        </w:rPr>
-        <w:t>s</w:t>
-      </w:r>
-      <w:r>
-        <w:rPr>
-          <w:i/>
-          <w:iCs/>
-        </w:rPr>
-        <w:t xml:space="preserve">. </w:t>
-      </w:r>
-    </w:p>
-    <w:p>
-      <w:pPr>
-        <w:rPr>
-          <w:i/>
-          <w:iCs/>
-        </w:rPr>
-      </w:pPr>
-      <w:r>
-        <w:rPr>
-          <w:i/>
-          <w:iCs/>
-        </w:rPr>
-        <w:t>Moon rock</w:t>
-      </w:r>
-      <w:r>
-        <w:rPr>
-          <w:i/>
-          <w:iCs/>
-        </w:rPr>
-        <w:t xml:space="preserve"> gleam</w:t>
-      </w:r>
-      <w:r>
-        <w:rPr>
-          <w:i/>
-          <w:iCs/>
-        </w:rPr>
-        <w:t>s</w:t>
-      </w:r>
-      <w:r>
-        <w:rPr>
-          <w:i/>
-          <w:iCs/>
-        </w:rPr>
-        <w:t>.</w:t>
-      </w:r>
-    </w:p>
-    <w:p>
-      <w:pPr>
-        <w:rPr>
-          <w:i/>
-          <w:iCs/>
-        </w:rPr>
-      </w:pPr>
-      <w:r>
-        <w:rPr>
-          <w:i/>
-          <w:iCs/>
-        </w:rPr>
-        <w:t>Space crinkle</w:t>
-      </w:r>
-      <w:r>
-        <w:rPr>
-          <w:i/>
-          <w:iCs/>
-        </w:rPr>
-        <w:t>s.</w:t>
-      </w:r>
-      <w:r>
-        <w:rPr>
-          <w:i/>
-          <w:iCs/>
-        </w:rPr>
-        <w:t xml:space="preserve"> </w:t>
-      </w:r>
-    </w:p>
-    <w:p>
-      <w:pPr>
-        <w:rPr>
-          <w:i/>
-          <w:iCs/>
-        </w:rPr>
-      </w:pPr>
-      <w:r>
-        <w:rPr>
-          <w:i/>
-          <w:iCs/>
-        </w:rPr>
-        <w:t>A</w:t>
-      </w:r>
-      <w:r>
-        <w:rPr>
-          <w:i/>
-          <w:iCs/>
-        </w:rPr>
-        <w:t>t the seam</w:t>
-      </w:r>
-      <w:r>
-        <w:rPr>
-          <w:i/>
-          <w:iCs/>
-        </w:rPr>
-        <w:t>s</w:t>
-      </w:r>
-      <w:r>
-        <w:rPr>
-          <w:i/>
-          <w:iCs/>
-        </w:rPr>
-        <w:t>.</w:t>
-      </w:r>
-    </w:p>
-    <w:p>
-      <w:pPr>
-        <w:jc w:val="both"/>
-        <w:rPr>
-          <w:i/>
-          <w:iCs/>
-        </w:rPr>
-      </w:pPr>
-      <w:r>
-        <w:rPr>
-          <w:i/>
-          <w:iCs/>
-        </w:rPr>
-        <w:t>Smirk</w:t>
-      </w:r>
-      <w:r>
-        <w:rPr>
-          <w:i/>
-          <w:iCs/>
-        </w:rPr>
-        <w:t>s</w:t>
-      </w:r>
-      <w:r>
-        <w:rPr>
-          <w:i/>
-          <w:iCs/>
-        </w:rPr>
-        <w:t>. Inkle</w:t>
-      </w:r>
-      <w:r>
-        <w:rPr>
-          <w:i/>
-          <w:iCs/>
-        </w:rPr>
-        <w:t>s</w:t>
-      </w:r>
-      <w:r>
-        <w:rPr>
-          <w:i/>
-          <w:iCs/>
-        </w:rPr>
-        <w:t>.</w:t>
-      </w:r>
-    </w:p>
-    <w:p>
-      <w:pPr>
-        <w:jc w:val="both"/>
-        <w:rPr>
-          <w:rFonts w:cs="Segoe UI Emoji"/>
-          <w:i/>
-          <w:iCs/>
-        </w:rPr>
-      </w:pPr>
-      <w:r>
-        <w:rPr>
-          <w:i/>
-          <w:iCs/>
-        </w:rPr>
-        <w:t>In a dream</w:t>
-      </w:r>
-      <w:r>
-        <w:rPr>
-          <w:rFonts w:cs="Segoe UI Emoji"/>
-          <w:i/>
-          <w:iCs/>
-        </w:rPr>
-        <w:t xml:space="preserve"> …</w:t>
-      </w:r>
-    </w:p>
-    <w:p>
-      <w:pPr>
-        <w:jc w:val="both"/>
+      </w:pPr>
+      <w:r>
         <w:rPr>
           <w:rFonts w:cs="Segoe UI Emoji"/>
           <w:b/>
           <w:bCs/>
           <w:u w:val="single"/>
         </w:rPr>
-      </w:pPr>
-      <w:r>
+        <w:t>Star Woven:</w:t>
+      </w:r>
+    </w:p>
+    <w:p>
+      <w:pPr>
+        <w:rPr>
+          <w:i/>
+          <w:iCs/>
+        </w:rPr>
+      </w:pPr>
+      <w:r>
+        <w:rPr>
+          <w:i/>
+          <w:iCs/>
+        </w:rPr>
+        <w:t>Star twinkle</w:t>
+      </w:r>
+      <w:r>
+        <w:rPr>
+          <w:i/>
+          <w:iCs/>
+        </w:rPr>
+        <w:t>s</w:t>
+      </w:r>
+      <w:r>
+        <w:rPr>
+          <w:i/>
+          <w:iCs/>
+        </w:rPr>
+        <w:t xml:space="preserve">. </w:t>
+      </w:r>
+    </w:p>
+    <w:p>
+      <w:pPr>
+        <w:rPr>
+          <w:i/>
+          <w:iCs/>
+        </w:rPr>
+      </w:pPr>
+      <w:r>
+        <w:rPr>
+          <w:i/>
+          <w:iCs/>
+        </w:rPr>
+        <w:t>Moon rock</w:t>
+      </w:r>
+      <w:r>
+        <w:rPr>
+          <w:i/>
+          <w:iCs/>
+        </w:rPr>
+        <w:t xml:space="preserve"> gleam</w:t>
+      </w:r>
+      <w:r>
+        <w:rPr>
+          <w:i/>
+          <w:iCs/>
+        </w:rPr>
+        <w:t>s</w:t>
+      </w:r>
+      <w:r>
+        <w:rPr>
+          <w:i/>
+          <w:iCs/>
+        </w:rPr>
+        <w:t>.</w:t>
+      </w:r>
+    </w:p>
+    <w:p>
+      <w:pPr>
+        <w:rPr>
+          <w:i/>
+          <w:iCs/>
+        </w:rPr>
+      </w:pPr>
+      <w:r>
+        <w:rPr>
+          <w:i/>
+          <w:iCs/>
+        </w:rPr>
+        <w:t>Space crinkle</w:t>
+      </w:r>
+      <w:r>
+        <w:rPr>
+          <w:i/>
+          <w:iCs/>
+        </w:rPr>
+        <w:t>s.</w:t>
+      </w:r>
+      <w:r>
+        <w:rPr>
+          <w:i/>
+          <w:iCs/>
+        </w:rPr>
+        <w:t xml:space="preserve"> </w:t>
+      </w:r>
+    </w:p>
+    <w:p>
+      <w:pPr>
+        <w:rPr>
+          <w:i/>
+          <w:iCs/>
+        </w:rPr>
+      </w:pPr>
+      <w:r>
+        <w:rPr>
+          <w:i/>
+          <w:iCs/>
+        </w:rPr>
+        <w:t>A</w:t>
+      </w:r>
+      <w:r>
+        <w:rPr>
+          <w:i/>
+          <w:iCs/>
+        </w:rPr>
+        <w:t>t the seam</w:t>
+      </w:r>
+      <w:r>
+        <w:rPr>
+          <w:i/>
+          <w:iCs/>
+        </w:rPr>
+        <w:t>s</w:t>
+      </w:r>
+      <w:r>
+        <w:rPr>
+          <w:i/>
+          <w:iCs/>
+        </w:rPr>
+        <w:t>.</w:t>
+      </w:r>
+    </w:p>
+    <w:p>
+      <w:pPr>
+        <w:jc w:val="both"/>
+        <w:rPr>
+          <w:i/>
+          <w:iCs/>
+        </w:rPr>
+      </w:pPr>
+      <w:r>
+        <w:rPr>
+          <w:i/>
+          <w:iCs/>
+        </w:rPr>
+        <w:t>Smirk</w:t>
+      </w:r>
+      <w:r>
+        <w:rPr>
+          <w:i/>
+          <w:iCs/>
+        </w:rPr>
+        <w:t>s</w:t>
+      </w:r>
+      <w:r>
+        <w:rPr>
+          <w:i/>
+          <w:iCs/>
+        </w:rPr>
+        <w:t>. Inkle</w:t>
+      </w:r>
+      <w:r>
+        <w:rPr>
+          <w:i/>
+          <w:iCs/>
+        </w:rPr>
+        <w:t>s</w:t>
+      </w:r>
+      <w:r>
+        <w:rPr>
+          <w:i/>
+          <w:iCs/>
+        </w:rPr>
+        <w:t>.</w:t>
+      </w:r>
+    </w:p>
+    <w:p>
+      <w:pPr>
+        <w:jc w:val="both"/>
+        <w:rPr>
+          <w:rFonts w:cs="Segoe UI Emoji"/>
+          <w:i/>
+          <w:iCs/>
+        </w:rPr>
+      </w:pPr>
+      <w:r>
+        <w:rPr>
+          <w:i/>
+          <w:iCs/>
+        </w:rPr>
+        <w:t>In a dream</w:t>
+      </w:r>
+      <w:r>
+        <w:rPr>
+          <w:rFonts w:cs="Segoe UI Emoji"/>
+          <w:i/>
+          <w:iCs/>
+        </w:rPr>
+        <w:t xml:space="preserve"> …</w:t>
+      </w:r>
+    </w:p>
+    <w:p>
+      <w:pPr>
+        <w:jc w:val="both"/>
         <w:rPr>
           <w:rFonts w:cs="Segoe UI Emoji"/>
           <w:b/>
           <w:bCs/>
           <w:u w:val="single"/>
         </w:rPr>
+      </w:pPr>
+      <w:r>
+        <w:rPr>
+          <w:rFonts w:cs="Segoe UI Emoji"/>
+          <w:b/>
+          <w:bCs/>
+          <w:u w:val="single"/>
+        </w:rPr>
         <w:t>Shadowed and Cornered:</w:t>
       </w:r>
     </w:p>
@@ -1290,7 +1290,23 @@
           <w:i/>
           <w:iCs/>
         </w:rPr>
-        <w:t xml:space="preserve"> not defined.</w:t>
+        <w:t xml:space="preserve"> </w:t>
+      </w:r>
+      <w:proofErr w:type="gramStart"/>
+      <w:r>
+        <w:rPr>
+          <w:i/>
+          <w:iCs/>
+        </w:rPr>
+        <w:t>not</w:t>
+      </w:r>
+      <w:proofErr w:type="gramEnd"/>
+      <w:r>
+        <w:rPr>
+          <w:i/>
+          <w:iCs/>
+        </w:rPr>
+        <w:t xml:space="preserve"> defined.</w:t>
       </w:r>
     </w:p>
     <w:sectPr>

</xml_diff>